<commit_message>
Focused skills to WebDev and added new projects. WIP
</commit_message>
<xml_diff>
--- a/resume - omar jimenez - PLANTILLA.docx
+++ b/resume - omar jimenez - PLANTILLA.docx
@@ -556,7 +556,25 @@
                 <w:szCs w:val="18"/>
                 <w:lang w:val="en-US"/>
               </w:rPr>
-              <w:t xml:space="preserve">Constantly learning new things and sharing them with others. Passionate about development and research. Interested in: </w:t>
+              <w:t xml:space="preserve">Constantly learning new things and sharing them with others. Passionate about development and </w:t>
+            </w:r>
+            <w:r>
+              <w:rPr>
+                <w:rFonts w:ascii="Calibri Light" w:hAnsi="Calibri Light" w:cs="Calibri Light"/>
+                <w:sz w:val="18"/>
+                <w:szCs w:val="18"/>
+                <w:lang w:val="en-US"/>
+              </w:rPr>
+              <w:t>facing challenges</w:t>
+            </w:r>
+            <w:r>
+              <w:rPr>
+                <w:rFonts w:ascii="Calibri Light" w:hAnsi="Calibri Light" w:cs="Calibri Light"/>
+                <w:sz w:val="18"/>
+                <w:szCs w:val="18"/>
+                <w:lang w:val="en-US"/>
+              </w:rPr>
+              <w:t xml:space="preserve">. Interested in: </w:t>
             </w:r>
           </w:p>
           <w:p>
@@ -573,14 +591,25 @@
                 <w:lang w:val="en-US"/>
               </w:rPr>
             </w:pPr>
-            <w:r>
-              <w:rPr>
-                <w:rFonts w:ascii="Calibri Light" w:hAnsi="Calibri Light" w:cs="Calibri Light"/>
-                <w:sz w:val="18"/>
-                <w:szCs w:val="18"/>
-                <w:lang w:val="en-US"/>
-              </w:rPr>
-              <w:t xml:space="preserve">Networking. </w:t>
+            <w:proofErr w:type="spellStart"/>
+            <w:r>
+              <w:rPr>
+                <w:rFonts w:ascii="Calibri Light" w:hAnsi="Calibri Light" w:cs="Calibri Light"/>
+                <w:sz w:val="18"/>
+                <w:szCs w:val="18"/>
+                <w:lang w:val="en-US"/>
+              </w:rPr>
+              <w:t>Fullstack</w:t>
+            </w:r>
+            <w:proofErr w:type="spellEnd"/>
+            <w:r>
+              <w:rPr>
+                <w:rFonts w:ascii="Calibri Light" w:hAnsi="Calibri Light" w:cs="Calibri Light"/>
+                <w:sz w:val="18"/>
+                <w:szCs w:val="18"/>
+                <w:lang w:val="en-US"/>
+              </w:rPr>
+              <w:t xml:space="preserve"> Development</w:t>
             </w:r>
           </w:p>
           <w:p>
@@ -604,7 +633,7 @@
                 <w:szCs w:val="18"/>
                 <w:lang w:val="en-US"/>
               </w:rPr>
-              <w:t xml:space="preserve">Artificial Intelligence specializing in Agent Systems and Behavior. </w:t>
+              <w:t>Either Frontend or Backend Development</w:t>
             </w:r>
           </w:p>
           <w:p>
@@ -628,31 +657,7 @@
                 <w:szCs w:val="18"/>
                 <w:lang w:val="en-US"/>
               </w:rPr>
-              <w:t xml:space="preserve">Cybersecurity (blue team, read team and forensics). </w:t>
-            </w:r>
-          </w:p>
-          <w:p>
-            <w:pPr>
-              <w:pStyle w:val="Prrafodelista"/>
-              <w:numPr>
-                <w:ilvl w:val="0"/>
-                <w:numId w:val="2"/>
-              </w:numPr>
-              <w:rPr>
-                <w:rFonts w:ascii="Calibri Light" w:hAnsi="Calibri Light" w:cs="Calibri Light"/>
-                <w:sz w:val="18"/>
-                <w:szCs w:val="18"/>
-                <w:lang w:val="en-US"/>
-              </w:rPr>
-            </w:pPr>
-            <w:r>
-              <w:rPr>
-                <w:rFonts w:ascii="Calibri Light" w:hAnsi="Calibri Light" w:cs="Calibri Light"/>
-                <w:sz w:val="18"/>
-                <w:szCs w:val="18"/>
-                <w:lang w:val="en-US"/>
-              </w:rPr>
-              <w:t>Research and development.</w:t>
+              <w:t>Designing, Building and Deploying apps.</w:t>
             </w:r>
           </w:p>
         </w:tc>
@@ -1069,7 +1074,6 @@
                 <w:lang w:val="en-US"/>
               </w:rPr>
             </w:pPr>
-            <w:proofErr w:type="gramStart"/>
             <w:r>
               <w:rPr>
                 <w:rFonts w:ascii="Calibri Light" w:hAnsi="Calibri Light" w:cs="Calibri Light"/>
@@ -1079,19 +1083,7 @@
                 <w:szCs w:val="20"/>
                 <w:lang w:val="en-US"/>
               </w:rPr>
-              <w:t>Proficient</w:t>
-            </w:r>
-            <w:proofErr w:type="gramEnd"/>
-            <w:r>
-              <w:rPr>
-                <w:rFonts w:ascii="Calibri Light" w:hAnsi="Calibri Light" w:cs="Calibri Light"/>
-                <w:b/>
-                <w:bCs/>
-                <w:sz w:val="20"/>
-                <w:szCs w:val="20"/>
-                <w:lang w:val="en-US"/>
-              </w:rPr>
-              <w:t xml:space="preserve">: </w:t>
+              <w:t xml:space="preserve">Proficient: </w:t>
             </w:r>
           </w:p>
           <w:p>
@@ -1176,7 +1168,6 @@
                 <w:lang w:val="en-US"/>
               </w:rPr>
             </w:pPr>
-            <w:proofErr w:type="gramStart"/>
             <w:r>
               <w:rPr>
                 <w:rFonts w:ascii="Calibri Light" w:hAnsi="Calibri Light" w:cs="Calibri Light"/>
@@ -1186,38 +1177,44 @@
                 <w:szCs w:val="20"/>
                 <w:lang w:val="en-US"/>
               </w:rPr>
-              <w:t>Proficient</w:t>
-            </w:r>
-            <w:proofErr w:type="gramEnd"/>
-            <w:r>
-              <w:rPr>
-                <w:rFonts w:ascii="Calibri Light" w:hAnsi="Calibri Light" w:cs="Calibri Light"/>
-                <w:b/>
-                <w:bCs/>
-                <w:sz w:val="20"/>
-                <w:szCs w:val="20"/>
-                <w:lang w:val="en-US"/>
-              </w:rPr>
-              <w:t xml:space="preserve">: </w:t>
-            </w:r>
-          </w:p>
-          <w:p>
-            <w:pPr>
-              <w:rPr>
-                <w:rFonts w:ascii="Calibri Light" w:hAnsi="Calibri Light" w:cs="Calibri Light"/>
-                <w:sz w:val="18"/>
-                <w:szCs w:val="18"/>
-                <w:lang w:val="en-US"/>
-              </w:rPr>
-            </w:pPr>
-            <w:r>
-              <w:rPr>
-                <w:rFonts w:ascii="Calibri Light" w:hAnsi="Calibri Light" w:cs="Calibri Light"/>
-                <w:sz w:val="18"/>
-                <w:szCs w:val="18"/>
-                <w:lang w:val="en-US"/>
-              </w:rPr>
-              <w:t>Git and GitHub. Unity, MATLAB, SQL, Godot Engine, Mesa, PostgreSQL, Linux (Ubuntu), .NET (</w:t>
+              <w:t xml:space="preserve">Proficient: </w:t>
+            </w:r>
+          </w:p>
+          <w:p>
+            <w:pPr>
+              <w:rPr>
+                <w:rFonts w:ascii="Calibri Light" w:hAnsi="Calibri Light" w:cs="Calibri Light"/>
+                <w:sz w:val="18"/>
+                <w:szCs w:val="18"/>
+                <w:lang w:val="en-US"/>
+              </w:rPr>
+            </w:pPr>
+            <w:r>
+              <w:rPr>
+                <w:rFonts w:ascii="Calibri Light" w:hAnsi="Calibri Light" w:cs="Calibri Light"/>
+                <w:sz w:val="18"/>
+                <w:szCs w:val="18"/>
+                <w:lang w:val="en-US"/>
+              </w:rPr>
+              <w:t>Git and GitHub</w:t>
+            </w:r>
+            <w:r>
+              <w:rPr>
+                <w:rFonts w:ascii="Calibri Light" w:hAnsi="Calibri Light" w:cs="Calibri Light"/>
+                <w:sz w:val="18"/>
+                <w:szCs w:val="18"/>
+                <w:lang w:val="en-US"/>
+              </w:rPr>
+              <w:t>,</w:t>
+            </w:r>
+            <w:r>
+              <w:rPr>
+                <w:rFonts w:ascii="Calibri Light" w:hAnsi="Calibri Light" w:cs="Calibri Light"/>
+                <w:sz w:val="18"/>
+                <w:szCs w:val="18"/>
+                <w:lang w:val="en-US"/>
+              </w:rPr>
+              <w:t xml:space="preserve"> Unity, MATLAB, SQL, Godot Engine, Mesa, PostgreSQL, Linux (Ubuntu), .NET (</w:t>
             </w:r>
             <w:proofErr w:type="spellStart"/>
             <w:r>
@@ -1237,7 +1234,43 @@
                 <w:szCs w:val="18"/>
                 <w:lang w:val="en-US"/>
               </w:rPr>
-              <w:t>).</w:t>
+              <w:t>)</w:t>
+            </w:r>
+            <w:r>
+              <w:rPr>
+                <w:rFonts w:ascii="Calibri Light" w:hAnsi="Calibri Light" w:cs="Calibri Light"/>
+                <w:sz w:val="18"/>
+                <w:szCs w:val="18"/>
+                <w:lang w:val="en-US"/>
+              </w:rPr>
+              <w:t xml:space="preserve">, </w:t>
+            </w:r>
+            <w:r>
+              <w:rPr>
+                <w:rFonts w:ascii="Calibri Light" w:hAnsi="Calibri Light" w:cs="Calibri Light"/>
+                <w:sz w:val="18"/>
+                <w:szCs w:val="18"/>
+                <w:lang w:val="en-US"/>
+              </w:rPr>
+              <w:t>HTML, CSS</w:t>
+            </w:r>
+            <w:r>
+              <w:rPr>
+                <w:rFonts w:ascii="Calibri Light" w:hAnsi="Calibri Light" w:cs="Calibri Light"/>
+                <w:sz w:val="18"/>
+                <w:szCs w:val="18"/>
+                <w:lang w:val="en-US"/>
+              </w:rPr>
+              <w:t>, Node, React, Express</w:t>
+            </w:r>
+            <w:r>
+              <w:rPr>
+                <w:rFonts w:ascii="Calibri Light" w:hAnsi="Calibri Light" w:cs="Calibri Light"/>
+                <w:sz w:val="18"/>
+                <w:szCs w:val="18"/>
+                <w:lang w:val="en-US"/>
+              </w:rPr>
+              <w:t>.</w:t>
             </w:r>
           </w:p>
         </w:tc>
@@ -1388,30 +1421,6 @@
                 <w:szCs w:val="18"/>
                 <w:lang w:val="en-US"/>
               </w:rPr>
-              <w:t xml:space="preserve">Hacker methodology, </w:t>
-            </w:r>
-          </w:p>
-          <w:p>
-            <w:pPr>
-              <w:pStyle w:val="Prrafodelista"/>
-              <w:numPr>
-                <w:ilvl w:val="0"/>
-                <w:numId w:val="1"/>
-              </w:numPr>
-              <w:rPr>
-                <w:rFonts w:ascii="Calibri Light" w:hAnsi="Calibri Light" w:cs="Calibri Light"/>
-                <w:sz w:val="18"/>
-                <w:szCs w:val="18"/>
-                <w:lang w:val="en-US"/>
-              </w:rPr>
-            </w:pPr>
-            <w:r>
-              <w:rPr>
-                <w:rFonts w:ascii="Calibri Light" w:hAnsi="Calibri Light" w:cs="Calibri Light"/>
-                <w:sz w:val="18"/>
-                <w:szCs w:val="18"/>
-                <w:lang w:val="en-US"/>
-              </w:rPr>
               <w:t xml:space="preserve">Teamwork and willingness to learn. </w:t>
             </w:r>
           </w:p>
@@ -1545,67 +1554,7 @@
                 <w:szCs w:val="18"/>
                 <w:lang w:val="en-US"/>
               </w:rPr>
-              <w:t xml:space="preserve">Cisco CLI, Cisco routers and switches, Packet Tracer, HTML, CSS, </w:t>
-            </w:r>
-            <w:proofErr w:type="spellStart"/>
-            <w:r>
-              <w:rPr>
-                <w:rFonts w:ascii="Calibri Light" w:hAnsi="Calibri Light" w:cs="Calibri Light"/>
-                <w:sz w:val="18"/>
-                <w:szCs w:val="18"/>
-                <w:lang w:val="en-US"/>
-              </w:rPr>
-              <w:t>XCode</w:t>
-            </w:r>
-            <w:proofErr w:type="spellEnd"/>
-            <w:r>
-              <w:rPr>
-                <w:rFonts w:ascii="Calibri Light" w:hAnsi="Calibri Light" w:cs="Calibri Light"/>
-                <w:sz w:val="18"/>
-                <w:szCs w:val="18"/>
-                <w:lang w:val="en-US"/>
-              </w:rPr>
-              <w:t xml:space="preserve">, Android Studio, Phoenix, Flask, Firebase, Bootstrap, React, </w:t>
-            </w:r>
-            <w:proofErr w:type="spellStart"/>
-            <w:r>
-              <w:rPr>
-                <w:rFonts w:ascii="Calibri Light" w:hAnsi="Calibri Light" w:cs="Calibri Light"/>
-                <w:sz w:val="18"/>
-                <w:szCs w:val="18"/>
-                <w:lang w:val="en-US"/>
-              </w:rPr>
-              <w:t>Node.Js</w:t>
-            </w:r>
-            <w:proofErr w:type="spellEnd"/>
-            <w:r>
-              <w:rPr>
-                <w:rFonts w:ascii="Calibri Light" w:hAnsi="Calibri Light" w:cs="Calibri Light"/>
-                <w:sz w:val="18"/>
-                <w:szCs w:val="18"/>
-                <w:lang w:val="en-US"/>
-              </w:rPr>
-              <w:t xml:space="preserve">, </w:t>
-            </w:r>
-            <w:proofErr w:type="spellStart"/>
-            <w:r>
-              <w:rPr>
-                <w:rFonts w:ascii="Calibri Light" w:hAnsi="Calibri Light" w:cs="Calibri Light"/>
-                <w:sz w:val="18"/>
-                <w:szCs w:val="18"/>
-                <w:lang w:val="en-US"/>
-              </w:rPr>
-              <w:t>Vue.Js</w:t>
-            </w:r>
-            <w:proofErr w:type="spellEnd"/>
-            <w:r>
-              <w:rPr>
-                <w:rFonts w:ascii="Calibri Light" w:hAnsi="Calibri Light" w:cs="Calibri Light"/>
-                <w:sz w:val="18"/>
-                <w:szCs w:val="18"/>
-                <w:lang w:val="en-US"/>
-              </w:rPr>
-              <w:t>, Django, Kali Linux, Wireshark, Angular, AWS, Azure.</w:t>
+              <w:t>Phoenix, Flask, Firebase, Bootstrap, Vue, Django, Angular, AWS, Azure.</w:t>
             </w:r>
           </w:p>
         </w:tc>
@@ -1771,7 +1720,40 @@
                 <w:szCs w:val="20"/>
                 <w:lang w:val="en-US"/>
               </w:rPr>
-              <w:t>Jun 2024 – Jun 2025</w:t>
+              <w:t xml:space="preserve">Jun 2024 – </w:t>
+            </w:r>
+            <w:r>
+              <w:rPr>
+                <w:rFonts w:ascii="Calibri Light" w:hAnsi="Calibri Light" w:cs="Calibri Light"/>
+                <w:b/>
+                <w:bCs/>
+                <w:sz w:val="20"/>
+                <w:szCs w:val="20"/>
+                <w:lang w:val="en-US"/>
+              </w:rPr>
+              <w:t xml:space="preserve">Jan </w:t>
+            </w:r>
+            <w:r>
+              <w:rPr>
+                <w:rFonts w:ascii="Calibri Light" w:hAnsi="Calibri Light" w:cs="Calibri Light"/>
+                <w:b/>
+                <w:bCs/>
+                <w:sz w:val="20"/>
+                <w:szCs w:val="20"/>
+                <w:lang w:val="en-US"/>
+              </w:rPr>
+              <w:t>202</w:t>
+            </w:r>
+            <w:r>
+              <w:rPr>
+                <w:rFonts w:ascii="Calibri Light" w:hAnsi="Calibri Light" w:cs="Calibri Light"/>
+                <w:b/>
+                <w:bCs/>
+                <w:sz w:val="20"/>
+                <w:szCs w:val="20"/>
+                <w:lang w:val="en-US"/>
+              </w:rPr>
+              <w:t>6</w:t>
             </w:r>
           </w:p>
         </w:tc>
@@ -2021,7 +2003,25 @@
                 <w:szCs w:val="18"/>
                 <w:lang w:val="en-US"/>
               </w:rPr>
-              <w:t>Adapted quickly to various in-house tools and the corporate environment. Acquired communication soft skills and experience handling customers.</w:t>
+              <w:t>Adapted quickly to various in-house tools and the corporate environment. Acquired communication soft skills and experience handling customers</w:t>
+            </w:r>
+            <w:r>
+              <w:rPr>
+                <w:rFonts w:ascii="Calibri Light" w:hAnsi="Calibri Light" w:cs="Calibri Light"/>
+                <w:sz w:val="18"/>
+                <w:szCs w:val="18"/>
+                <w:lang w:val="en-US"/>
+              </w:rPr>
+              <w:t xml:space="preserve"> and collaborating with colleagues</w:t>
+            </w:r>
+            <w:r>
+              <w:rPr>
+                <w:rFonts w:ascii="Calibri Light" w:hAnsi="Calibri Light" w:cs="Calibri Light"/>
+                <w:sz w:val="18"/>
+                <w:szCs w:val="18"/>
+                <w:lang w:val="en-US"/>
+              </w:rPr>
+              <w:t>.</w:t>
             </w:r>
           </w:p>
         </w:tc>
@@ -2979,27 +2979,63 @@
                 <w:szCs w:val="18"/>
                 <w:lang w:val="en-US"/>
               </w:rPr>
-              <w:t xml:space="preserve">This web platform was built in partnership with the Computer Science Department at ITESM to help both teachers and students ease the learning experience by automating coding </w:t>
-            </w:r>
-            <w:proofErr w:type="spellStart"/>
-            <w:r>
-              <w:rPr>
-                <w:rFonts w:ascii="Calibri Light" w:hAnsi="Calibri Light" w:cs="Calibri Light"/>
-                <w:sz w:val="18"/>
-                <w:szCs w:val="18"/>
-                <w:lang w:val="en-US"/>
-              </w:rPr>
-              <w:t>excercises</w:t>
-            </w:r>
-            <w:proofErr w:type="spellEnd"/>
-            <w:r>
-              <w:rPr>
-                <w:rFonts w:ascii="Calibri Light" w:hAnsi="Calibri Light" w:cs="Calibri Light"/>
-                <w:sz w:val="18"/>
-                <w:szCs w:val="18"/>
-                <w:lang w:val="en-US"/>
-              </w:rPr>
-              <w:t xml:space="preserve"> and creating a learning roadmap based on the course’s curriculum. Frontend developed using Angular, backend built using </w:t>
+              <w:t>This web platform was built in partnership with the Computer Science Department at ITESM to help both teachers and students ease the</w:t>
+            </w:r>
+            <w:r>
+              <w:rPr>
+                <w:rFonts w:ascii="Calibri Light" w:hAnsi="Calibri Light" w:cs="Calibri Light"/>
+                <w:sz w:val="18"/>
+                <w:szCs w:val="18"/>
+                <w:lang w:val="en-US"/>
+              </w:rPr>
+              <w:t>ir</w:t>
+            </w:r>
+            <w:r>
+              <w:rPr>
+                <w:rFonts w:ascii="Calibri Light" w:hAnsi="Calibri Light" w:cs="Calibri Light"/>
+                <w:sz w:val="18"/>
+                <w:szCs w:val="18"/>
+                <w:lang w:val="en-US"/>
+              </w:rPr>
+              <w:t xml:space="preserve"> learning experience by automating coding </w:t>
+            </w:r>
+            <w:r>
+              <w:rPr>
+                <w:rFonts w:ascii="Calibri Light" w:hAnsi="Calibri Light" w:cs="Calibri Light"/>
+                <w:sz w:val="18"/>
+                <w:szCs w:val="18"/>
+                <w:lang w:val="en-US"/>
+              </w:rPr>
+              <w:t>exercises</w:t>
+            </w:r>
+            <w:r>
+              <w:rPr>
+                <w:rFonts w:ascii="Calibri Light" w:hAnsi="Calibri Light" w:cs="Calibri Light"/>
+                <w:sz w:val="18"/>
+                <w:szCs w:val="18"/>
+                <w:lang w:val="en-US"/>
+              </w:rPr>
+              <w:t xml:space="preserve"> and creating a learning roadmap based on the course’s curriculum. Frontend developed using </w:t>
+            </w:r>
+            <w:r>
+              <w:rPr>
+                <w:rFonts w:ascii="Calibri Light" w:hAnsi="Calibri Light" w:cs="Calibri Light"/>
+                <w:b/>
+                <w:bCs/>
+                <w:sz w:val="18"/>
+                <w:szCs w:val="18"/>
+                <w:lang w:val="en-US"/>
+              </w:rPr>
+              <w:t>React</w:t>
+            </w:r>
+            <w:r>
+              <w:rPr>
+                <w:rFonts w:ascii="Calibri Light" w:hAnsi="Calibri Light" w:cs="Calibri Light"/>
+                <w:sz w:val="18"/>
+                <w:szCs w:val="18"/>
+                <w:lang w:val="en-US"/>
+              </w:rPr>
+              <w:t xml:space="preserve">, backend built using </w:t>
             </w:r>
             <w:r>
               <w:rPr>
@@ -3143,7 +3179,47 @@
                 <w:szCs w:val="18"/>
                 <w:lang w:val="en-US"/>
               </w:rPr>
-              <w:t xml:space="preserve">Designed and built the relational database using </w:t>
+              <w:t xml:space="preserve">Designed </w:t>
+            </w:r>
+            <w:r>
+              <w:rPr>
+                <w:rFonts w:ascii="Calibri Light" w:hAnsi="Calibri Light" w:cs="Calibri Light"/>
+                <w:sz w:val="18"/>
+                <w:szCs w:val="18"/>
+                <w:lang w:val="en-US"/>
+              </w:rPr>
+              <w:t xml:space="preserve">on </w:t>
+            </w:r>
+            <w:proofErr w:type="spellStart"/>
+            <w:r>
+              <w:rPr>
+                <w:rFonts w:ascii="Calibri Light" w:hAnsi="Calibri Light" w:cs="Calibri Light"/>
+                <w:b/>
+                <w:bCs/>
+                <w:sz w:val="18"/>
+                <w:szCs w:val="18"/>
+                <w:lang w:val="en-US"/>
+              </w:rPr>
+              <w:t>Lucidchart</w:t>
+            </w:r>
+            <w:proofErr w:type="spellEnd"/>
+            <w:r>
+              <w:rPr>
+                <w:rFonts w:ascii="Calibri Light" w:hAnsi="Calibri Light" w:cs="Calibri Light"/>
+                <w:sz w:val="18"/>
+                <w:szCs w:val="18"/>
+                <w:lang w:val="en-US"/>
+              </w:rPr>
+              <w:t xml:space="preserve"> </w:t>
+            </w:r>
+            <w:r>
+              <w:rPr>
+                <w:rFonts w:ascii="Calibri Light" w:hAnsi="Calibri Light" w:cs="Calibri Light"/>
+                <w:sz w:val="18"/>
+                <w:szCs w:val="18"/>
+                <w:lang w:val="en-US"/>
+              </w:rPr>
+              <w:t xml:space="preserve">and built the relational database using </w:t>
             </w:r>
             <w:r>
               <w:rPr>
@@ -3163,7 +3239,25 @@
                 <w:szCs w:val="18"/>
                 <w:lang w:val="en-US"/>
               </w:rPr>
-              <w:t xml:space="preserve"> and deployed it on </w:t>
+              <w:t>. D</w:t>
+            </w:r>
+            <w:r>
+              <w:rPr>
+                <w:rFonts w:ascii="Calibri Light" w:hAnsi="Calibri Light" w:cs="Calibri Light"/>
+                <w:sz w:val="18"/>
+                <w:szCs w:val="18"/>
+                <w:lang w:val="en-US"/>
+              </w:rPr>
+              <w:t>eployed</w:t>
+            </w:r>
+            <w:r>
+              <w:rPr>
+                <w:rFonts w:ascii="Calibri Light" w:hAnsi="Calibri Light" w:cs="Calibri Light"/>
+                <w:sz w:val="18"/>
+                <w:szCs w:val="18"/>
+                <w:lang w:val="en-US"/>
+              </w:rPr>
+              <w:t xml:space="preserve"> it on </w:t>
             </w:r>
             <w:r>
               <w:rPr>
@@ -3323,6 +3417,7 @@
                 <w:lang w:val="en-US"/>
               </w:rPr>
             </w:pPr>
+            <w:proofErr w:type="spellStart"/>
             <w:r>
               <w:rPr>
                 <w:rFonts w:ascii="Calibri Light" w:hAnsi="Calibri Light" w:cs="Calibri Light"/>
@@ -3332,8 +3427,9 @@
                 <w:szCs w:val="20"/>
                 <w:lang w:val="en-US"/>
               </w:rPr>
-              <w:t xml:space="preserve">Network installation for a programming contest </w:t>
-            </w:r>
+              <w:t>Solumware</w:t>
+            </w:r>
+            <w:proofErr w:type="spellEnd"/>
           </w:p>
         </w:tc>
         <w:tc>
@@ -3401,7 +3497,7 @@
                 <w:szCs w:val="18"/>
                 <w:lang w:val="en-US"/>
               </w:rPr>
-              <w:t xml:space="preserve">This project consists of a </w:t>
+              <w:t xml:space="preserve">Prototype of </w:t>
             </w:r>
             <w:proofErr w:type="spellStart"/>
             <w:r>
@@ -3411,7 +3507,7 @@
                 <w:szCs w:val="18"/>
                 <w:lang w:val="en-US"/>
               </w:rPr>
-              <w:t>simullation</w:t>
+              <w:t>realtime</w:t>
             </w:r>
             <w:proofErr w:type="spellEnd"/>
             <w:r>
@@ -3421,65 +3517,100 @@
                 <w:szCs w:val="18"/>
                 <w:lang w:val="en-US"/>
               </w:rPr>
-              <w:t xml:space="preserve"> made in </w:t>
-            </w:r>
-            <w:r>
-              <w:rPr>
-                <w:rFonts w:ascii="Calibri Light" w:hAnsi="Calibri Light" w:cs="Calibri Light"/>
-                <w:b/>
-                <w:bCs/>
-                <w:sz w:val="18"/>
-                <w:szCs w:val="18"/>
-                <w:lang w:val="en-US"/>
-              </w:rPr>
-              <w:t>Packet Tracer</w:t>
-            </w:r>
-            <w:r>
-              <w:rPr>
-                <w:rFonts w:ascii="Calibri Light" w:hAnsi="Calibri Light" w:cs="Calibri Light"/>
-                <w:sz w:val="18"/>
-                <w:szCs w:val="18"/>
-                <w:lang w:val="en-US"/>
-              </w:rPr>
-              <w:t xml:space="preserve"> that represents the hypothetical installation of a network built </w:t>
-            </w:r>
-            <w:r>
-              <w:rPr>
-                <w:rFonts w:ascii="Calibri Light" w:hAnsi="Calibri Light" w:cs="Calibri Light"/>
-                <w:sz w:val="18"/>
-                <w:szCs w:val="18"/>
-                <w:lang w:val="en-US"/>
-              </w:rPr>
-              <w:t>to</w:t>
-            </w:r>
-            <w:r>
-              <w:rPr>
-                <w:rFonts w:ascii="Calibri Light" w:hAnsi="Calibri Light" w:cs="Calibri Light"/>
-                <w:sz w:val="18"/>
-                <w:szCs w:val="18"/>
-                <w:lang w:val="en-US"/>
-              </w:rPr>
-              <w:t xml:space="preserve"> support the Mexican Informatics Olympics at ITESM. It was then reproduced at a smaller scale physically using </w:t>
-            </w:r>
-            <w:r>
-              <w:rPr>
-                <w:rFonts w:ascii="Calibri Light" w:hAnsi="Calibri Light" w:cs="Calibri Light"/>
-                <w:b/>
-                <w:bCs/>
-                <w:sz w:val="18"/>
-                <w:szCs w:val="18"/>
-                <w:lang w:val="en-US"/>
-              </w:rPr>
-              <w:t>Cisco hardware</w:t>
-            </w:r>
-            <w:r>
-              <w:rPr>
-                <w:rFonts w:ascii="Calibri Light" w:hAnsi="Calibri Light" w:cs="Calibri Light"/>
-                <w:sz w:val="18"/>
-                <w:szCs w:val="18"/>
-                <w:lang w:val="en-US"/>
-              </w:rPr>
-              <w:t xml:space="preserve">. </w:t>
+              <w:t xml:space="preserve"> soil and climate monitoring app for farmers around the world. Collects real data using hardware, which is then sent over the cloud to our servers and displayed  via </w:t>
+            </w:r>
+            <w:r>
+              <w:rPr>
+                <w:rFonts w:ascii="Calibri Light" w:hAnsi="Calibri Light" w:cs="Calibri Light"/>
+                <w:b/>
+                <w:bCs/>
+                <w:sz w:val="18"/>
+                <w:szCs w:val="18"/>
+                <w:lang w:val="en-US"/>
+              </w:rPr>
+              <w:t>DS18B20</w:t>
+            </w:r>
+            <w:r>
+              <w:rPr>
+                <w:rFonts w:ascii="Calibri Light" w:hAnsi="Calibri Light" w:cs="Calibri Light"/>
+                <w:b/>
+                <w:bCs/>
+                <w:sz w:val="18"/>
+                <w:szCs w:val="18"/>
+                <w:lang w:val="en-US"/>
+              </w:rPr>
+              <w:t xml:space="preserve"> </w:t>
+            </w:r>
+            <w:r>
+              <w:rPr>
+                <w:rFonts w:ascii="Calibri Light" w:hAnsi="Calibri Light" w:cs="Calibri Light"/>
+                <w:sz w:val="18"/>
+                <w:szCs w:val="18"/>
+                <w:lang w:val="en-US"/>
+              </w:rPr>
+              <w:t>and</w:t>
+            </w:r>
+            <w:r>
+              <w:rPr>
+                <w:rFonts w:ascii="Calibri Light" w:hAnsi="Calibri Light" w:cs="Calibri Light"/>
+                <w:b/>
+                <w:bCs/>
+                <w:sz w:val="18"/>
+                <w:szCs w:val="18"/>
+                <w:lang w:val="en-US"/>
+              </w:rPr>
+              <w:t xml:space="preserve"> </w:t>
+            </w:r>
+            <w:r>
+              <w:rPr>
+                <w:rFonts w:ascii="Calibri Light" w:hAnsi="Calibri Light" w:cs="Calibri Light"/>
+                <w:b/>
+                <w:bCs/>
+                <w:sz w:val="18"/>
+                <w:szCs w:val="18"/>
+                <w:lang w:val="en-US"/>
+              </w:rPr>
+              <w:t>HC-SR04</w:t>
+            </w:r>
+            <w:r>
+              <w:rPr>
+                <w:rFonts w:ascii="Calibri Light" w:hAnsi="Calibri Light" w:cs="Calibri Light"/>
+                <w:sz w:val="18"/>
+                <w:szCs w:val="18"/>
+                <w:lang w:val="en-US"/>
+              </w:rPr>
+              <w:t xml:space="preserve"> sensors, connected to a </w:t>
+            </w:r>
+            <w:r>
+              <w:rPr>
+                <w:rFonts w:ascii="Calibri Light" w:hAnsi="Calibri Light" w:cs="Calibri Light"/>
+                <w:b/>
+                <w:bCs/>
+                <w:sz w:val="18"/>
+                <w:szCs w:val="18"/>
+                <w:lang w:val="en-US"/>
+              </w:rPr>
+              <w:t>Raspberry PI 4 B</w:t>
+            </w:r>
+            <w:r>
+              <w:rPr>
+                <w:rFonts w:ascii="Calibri Light" w:hAnsi="Calibri Light" w:cs="Calibri Light"/>
+                <w:b/>
+                <w:bCs/>
+                <w:sz w:val="18"/>
+                <w:szCs w:val="18"/>
+                <w:lang w:val="en-US"/>
+              </w:rPr>
+              <w:t xml:space="preserve"> </w:t>
+            </w:r>
+            <w:r>
+              <w:rPr>
+                <w:rFonts w:ascii="Calibri Light" w:hAnsi="Calibri Light" w:cs="Calibri Light"/>
+                <w:sz w:val="18"/>
+                <w:szCs w:val="18"/>
+                <w:lang w:val="en-US"/>
+              </w:rPr>
+              <w:t xml:space="preserve">device. </w:t>
             </w:r>
           </w:p>
           <w:p>

</xml_diff>